<commit_message>
Initial commit - EV VEHICLE VISUALIZATION  Project
</commit_message>
<xml_diff>
--- a/07_Documentation_and_Demo/Final_Report.docx
+++ b/07_Documentation_and_Demo/Final_Report.docx
@@ -739,7 +739,7 @@
           </mc:Choice>
           <mc:Fallback>
             <w:pict>
-              <v:shape w14:anchorId="49A8D9FE" id="Graphic 1" o:spid="_x0000_s1026" style="position:absolute;margin-left:36pt;margin-top:15.1pt;width:540.1pt;height:.85pt;z-index:-251730944;visibility:visible;mso-wrap-style:square;mso-wrap-distance-left:0;mso-wrap-distance-top:0;mso-wrap-distance-right:0;mso-wrap-distance-bottom:0;mso-position-horizontal:absolute;mso-position-horizontal-relative:page;mso-position-vertical:absolute;mso-position-vertical-relative:text;v-text-anchor:top" coordsize="6859270,10795" o:gfxdata="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" path="m6859270,l,,,10668r6859270,l6859270,xe" fillcolor="black" stroked="f">
+              <v:shape w14:anchorId="52FE3630" id="Graphic 1" o:spid="_x0000_s1026" style="position:absolute;margin-left:36pt;margin-top:15.1pt;width:540.1pt;height:.85pt;z-index:-251730944;visibility:visible;mso-wrap-style:square;mso-wrap-distance-left:0;mso-wrap-distance-top:0;mso-wrap-distance-right:0;mso-wrap-distance-bottom:0;mso-position-horizontal:absolute;mso-position-horizontal-relative:page;mso-position-vertical:absolute;mso-position-vertical-relative:text;v-text-anchor:top" coordsize="6859270,10795" o:gfxdata="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" path="m6859270,l,,,10668r6859270,l6859270,xe" fillcolor="black" stroked="f">
                 <v:path arrowok="t"/>
                 <w10:wrap type="topAndBottom" anchorx="page"/>
               </v:shape>
@@ -1128,22 +1128,52 @@
         <w:ind w:left="628" w:hanging="360"/>
       </w:pPr>
       <w:r>
-        <w:rPr>
+        <w:t>Empathy</w:t>
+      </w:r>
+      <w:r>
+        <w:rPr>
+          <w:spacing w:val="-2"/>
+        </w:rPr>
+        <w:t xml:space="preserve"> </w:t>
+      </w:r>
+      <w:r>
+        <w:t xml:space="preserve">Map </w:t>
+      </w:r>
+      <w:r>
+        <w:rPr>
+          <w:spacing w:val="-2"/>
+        </w:rPr>
+        <w:t>Canvas</w:t>
+      </w:r>
+    </w:p>
+    <w:p>
+      <w:pPr>
+        <w:pStyle w:val="Heading2"/>
+        <w:tabs>
+          <w:tab w:val="left" w:pos="628"/>
+        </w:tabs>
+        <w:ind w:left="628"/>
+        <w:jc w:val="right"/>
+      </w:pPr>
+      <w:r>
+        <w:rPr>
+          <w:b w:val="0"/>
           <w:noProof/>
+          <w:color w:val="2A2A2A"/>
         </w:rPr>
         <w:drawing>
-          <wp:anchor distT="0" distB="0" distL="114300" distR="114300" simplePos="0" relativeHeight="251595776" behindDoc="0" locked="0" layoutInCell="1" allowOverlap="1" wp14:anchorId="4A820581" wp14:editId="379098B3">
+          <wp:anchor distT="0" distB="0" distL="114300" distR="114300" simplePos="0" relativeHeight="251660288" behindDoc="0" locked="0" layoutInCell="1" allowOverlap="1" wp14:anchorId="090EFC87" wp14:editId="4235479E">
             <wp:simplePos x="0" y="0"/>
             <wp:positionH relativeFrom="column">
-              <wp:posOffset>241935</wp:posOffset>
+              <wp:posOffset>571500</wp:posOffset>
             </wp:positionH>
             <wp:positionV relativeFrom="paragraph">
-              <wp:posOffset>323215</wp:posOffset>
+              <wp:posOffset>39370</wp:posOffset>
             </wp:positionV>
-            <wp:extent cx="6532245" cy="3968750"/>
-            <wp:effectExtent l="0" t="0" r="1905" b="0"/>
+            <wp:extent cx="6126480" cy="3139440"/>
+            <wp:effectExtent l="0" t="0" r="7620" b="3810"/>
             <wp:wrapSquare wrapText="bothSides"/>
-            <wp:docPr id="53907843" name="Picture 3"/>
+            <wp:docPr id="161483624" name="Picture 1"/>
             <wp:cNvGraphicFramePr>
               <a:graphicFrameLocks xmlns:a="http://schemas.openxmlformats.org/drawingml/2006/main" noChangeAspect="1"/>
             </wp:cNvGraphicFramePr>
@@ -1151,7 +1181,7 @@
               <a:graphicData uri="http://schemas.openxmlformats.org/drawingml/2006/picture">
                 <pic:pic xmlns:pic="http://schemas.openxmlformats.org/drawingml/2006/picture">
                   <pic:nvPicPr>
-                    <pic:cNvPr id="53907843" name="Picture 53907843"/>
+                    <pic:cNvPr id="161483624" name="Picture 161483624"/>
                     <pic:cNvPicPr/>
                   </pic:nvPicPr>
                   <pic:blipFill>
@@ -1169,7 +1199,7 @@
                   <pic:spPr>
                     <a:xfrm>
                       <a:off x="0" y="0"/>
-                      <a:ext cx="6532245" cy="3968750"/>
+                      <a:ext cx="6126480" cy="3139440"/>
                     </a:xfrm>
                     <a:prstGeom prst="rect">
                       <a:avLst/>
@@ -1178,32 +1208,11 @@
                 </pic:pic>
               </a:graphicData>
             </a:graphic>
-            <wp14:sizeRelH relativeFrom="margin">
-              <wp14:pctWidth>0</wp14:pctWidth>
-            </wp14:sizeRelH>
             <wp14:sizeRelV relativeFrom="margin">
               <wp14:pctHeight>0</wp14:pctHeight>
             </wp14:sizeRelV>
           </wp:anchor>
         </w:drawing>
-      </w:r>
-      <w:r>
-        <w:t>Empathy</w:t>
-      </w:r>
-      <w:r>
-        <w:rPr>
-          <w:spacing w:val="-2"/>
-        </w:rPr>
-        <w:t xml:space="preserve"> </w:t>
-      </w:r>
-      <w:r>
-        <w:t xml:space="preserve">Map </w:t>
-      </w:r>
-      <w:r>
-        <w:rPr>
-          <w:spacing w:val="-2"/>
-        </w:rPr>
-        <w:t>Canvas</w:t>
       </w:r>
     </w:p>
     <w:p>
@@ -1242,7 +1251,6 @@
         <w:rPr>
           <w:spacing w:val="-2"/>
         </w:rPr>
-        <w:lastRenderedPageBreak/>
         <w:t>Brainstorming</w:t>
       </w:r>
     </w:p>
@@ -1412,6 +1420,7 @@
         <w:rPr>
           <w:spacing w:val="-2"/>
         </w:rPr>
+        <w:lastRenderedPageBreak/>
         <w:t>Brainstorming</w:t>
       </w:r>
       <w:r>
@@ -2789,7 +2798,7 @@
           </mc:Choice>
           <mc:Fallback>
             <w:pict>
-              <v:shape w14:anchorId="17518689" id="Graphic 3" o:spid="_x0000_s1026" style="position:absolute;margin-left:36pt;margin-top:12.75pt;width:540.1pt;height:.85pt;z-index:-15727616;visibility:visible;mso-wrap-style:square;mso-wrap-distance-left:0;mso-wrap-distance-top:0;mso-wrap-distance-right:0;mso-wrap-distance-bottom:0;mso-position-horizontal:absolute;mso-position-horizontal-relative:page;mso-position-vertical:absolute;mso-position-vertical-relative:text;v-text-anchor:top" coordsize="6859270,10795" o:gfxdata="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" path="m6859270,l,,,10668r6859270,l6859270,xe" fillcolor="black" stroked="f">
+              <v:shape w14:anchorId="43B19C7E" id="Graphic 3" o:spid="_x0000_s1026" style="position:absolute;margin-left:36pt;margin-top:12.75pt;width:540.1pt;height:.85pt;z-index:-15727616;visibility:visible;mso-wrap-style:square;mso-wrap-distance-left:0;mso-wrap-distance-top:0;mso-wrap-distance-right:0;mso-wrap-distance-bottom:0;mso-position-horizontal:absolute;mso-position-horizontal-relative:page;mso-position-vertical:absolute;mso-position-vertical-relative:text;v-text-anchor:top" coordsize="6859270,10795" o:gfxdata="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" path="m6859270,l,,,10668r6859270,l6859270,xe" fillcolor="black" stroked="f">
                 <v:path arrowok="t"/>
                 <w10:wrap type="topAndBottom" anchorx="page"/>
               </v:shape>
@@ -2978,7 +2987,7 @@
           </mc:Choice>
           <mc:Fallback>
             <w:pict>
-              <v:shapetype w14:anchorId="12B5BF1E" id="_x0000_t32" coordsize="21600,21600" o:spt="32" o:oned="t" path="m,l21600,21600e" filled="f">
+              <v:shapetype w14:anchorId="1F2B56F0" id="_x0000_t32" coordsize="21600,21600" o:spt="32" o:oned="t" path="m,l21600,21600e" filled="f">
                 <v:path arrowok="t" fillok="f" o:connecttype="none"/>
                 <o:lock v:ext="edit" shapetype="t"/>
               </v:shapetype>
@@ -3062,7 +3071,7 @@
           </mc:Choice>
           <mc:Fallback>
             <w:pict>
-              <v:shape w14:anchorId="58C1E877" id="Straight Arrow Connector 120" o:spid="_x0000_s1026" type="#_x0000_t32" style="position:absolute;margin-left:293.45pt;margin-top:17.25pt;width:0;height:20.2pt;z-index:251628544;visibility:visible;mso-wrap-style:square;mso-wrap-distance-left:9pt;mso-wrap-distance-top:0;mso-wrap-distance-right:9pt;mso-wrap-distance-bottom:0;mso-position-horizontal:absolute;mso-position-horizontal-relative:text;mso-position-vertical:absolute;mso-position-vertical-relative:text" o:gfxdata="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" strokecolor="black [3213]">
+              <v:shape w14:anchorId="415B4CCB" id="Straight Arrow Connector 120" o:spid="_x0000_s1026" type="#_x0000_t32" style="position:absolute;margin-left:293.45pt;margin-top:17.25pt;width:0;height:20.2pt;z-index:251628544;visibility:visible;mso-wrap-style:square;mso-wrap-distance-left:9pt;mso-wrap-distance-top:0;mso-wrap-distance-right:9pt;mso-wrap-distance-bottom:0;mso-position-horizontal:absolute;mso-position-horizontal-relative:text;mso-position-vertical:absolute;mso-position-vertical-relative:text" o:gfxdata="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" strokecolor="black [3213]">
                 <v:stroke endarrow="block"/>
               </v:shape>
             </w:pict>
@@ -3167,7 +3176,7 @@
           </mc:Choice>
           <mc:Fallback>
             <w:pict>
-              <v:shape w14:anchorId="5F068CA1" id="Straight Arrow Connector 120" o:spid="_x0000_s1026" type="#_x0000_t32" style="position:absolute;margin-left:293.45pt;margin-top:1.45pt;width:0;height:20.2pt;z-index:251630592;visibility:visible;mso-wrap-style:square;mso-wrap-distance-left:9pt;mso-wrap-distance-top:0;mso-wrap-distance-right:9pt;mso-wrap-distance-bottom:0;mso-position-horizontal:absolute;mso-position-horizontal-relative:text;mso-position-vertical:absolute;mso-position-vertical-relative:text" o:gfxdata="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" strokecolor="black [3213]">
+              <v:shape w14:anchorId="0FE3ADCA" id="Straight Arrow Connector 120" o:spid="_x0000_s1026" type="#_x0000_t32" style="position:absolute;margin-left:293.45pt;margin-top:1.45pt;width:0;height:20.2pt;z-index:251630592;visibility:visible;mso-wrap-style:square;mso-wrap-distance-left:9pt;mso-wrap-distance-top:0;mso-wrap-distance-right:9pt;mso-wrap-distance-bottom:0;mso-position-horizontal:absolute;mso-position-horizontal-relative:text;mso-position-vertical:absolute;mso-position-vertical-relative:text" o:gfxdata="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" strokecolor="black [3213]">
                 <v:stroke endarrow="block"/>
               </v:shape>
             </w:pict>
@@ -3185,7 +3194,6 @@
         <w:jc w:val="center"/>
       </w:pPr>
       <w:r>
-        <w:lastRenderedPageBreak/>
         <w:t>Open Tableau Dashboard / Story</w:t>
       </w:r>
     </w:p>
@@ -3260,7 +3268,7 @@
           </mc:Choice>
           <mc:Fallback>
             <w:pict>
-              <v:shape w14:anchorId="2A8EF205" id="Straight Arrow Connector 120" o:spid="_x0000_s1026" type="#_x0000_t32" style="position:absolute;margin-left:292.9pt;margin-top:-19.65pt;width:0;height:20.2pt;z-index:487611392;visibility:visible;mso-wrap-style:square;mso-wrap-distance-left:9pt;mso-wrap-distance-top:0;mso-wrap-distance-right:9pt;mso-wrap-distance-bottom:0;mso-position-horizontal:absolute;mso-position-horizontal-relative:text;mso-position-vertical:absolute;mso-position-vertical-relative:text" o:gfxdata="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" strokecolor="black [3213]">
+              <v:shape w14:anchorId="4E2FAC87" id="Straight Arrow Connector 120" o:spid="_x0000_s1026" type="#_x0000_t32" style="position:absolute;margin-left:292.9pt;margin-top:-19.65pt;width:0;height:20.2pt;z-index:487611392;visibility:visible;mso-wrap-style:square;mso-wrap-distance-left:9pt;mso-wrap-distance-top:0;mso-wrap-distance-right:9pt;mso-wrap-distance-bottom:0;mso-position-horizontal:absolute;mso-position-horizontal-relative:text;mso-position-vertical:absolute;mso-position-vertical-relative:text" o:gfxdata="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" strokecolor="black [3213]">
                 <v:stroke endarrow="block"/>
               </v:shape>
             </w:pict>
@@ -3342,7 +3350,7 @@
           </mc:Choice>
           <mc:Fallback>
             <w:pict>
-              <v:shape w14:anchorId="3A6813CC" id="Straight Arrow Connector 120" o:spid="_x0000_s1026" type="#_x0000_t32" style="position:absolute;margin-left:292.9pt;margin-top:3pt;width:0;height:20.2pt;z-index:251632640;visibility:visible;mso-wrap-style:square;mso-wrap-distance-left:9pt;mso-wrap-distance-top:0;mso-wrap-distance-right:9pt;mso-wrap-distance-bottom:0;mso-position-horizontal:absolute;mso-position-horizontal-relative:text;mso-position-vertical:absolute;mso-position-vertical-relative:text" o:gfxdata="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" strokecolor="black [3213]">
+              <v:shape w14:anchorId="45ECB3AC" id="Straight Arrow Connector 120" o:spid="_x0000_s1026" type="#_x0000_t32" style="position:absolute;margin-left:292.9pt;margin-top:3pt;width:0;height:20.2pt;z-index:251632640;visibility:visible;mso-wrap-style:square;mso-wrap-distance-left:9pt;mso-wrap-distance-top:0;mso-wrap-distance-right:9pt;mso-wrap-distance-bottom:0;mso-position-horizontal:absolute;mso-position-horizontal-relative:text;mso-position-vertical:absolute;mso-position-vertical-relative:text" o:gfxdata="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" strokecolor="black [3213]">
                 <v:stroke endarrow="block"/>
               </v:shape>
             </w:pict>
@@ -3421,7 +3429,7 @@
           </mc:Choice>
           <mc:Fallback>
             <w:pict>
-              <v:shape w14:anchorId="3B5BE3B0" id="Straight Arrow Connector 120" o:spid="_x0000_s1026" type="#_x0000_t32" style="position:absolute;margin-left:294pt;margin-top:17.55pt;width:0;height:20.2pt;z-index:251634688;visibility:visible;mso-wrap-style:square;mso-wrap-distance-left:9pt;mso-wrap-distance-top:0;mso-wrap-distance-right:9pt;mso-wrap-distance-bottom:0;mso-position-horizontal:absolute;mso-position-horizontal-relative:text;mso-position-vertical:absolute;mso-position-vertical-relative:text" o:gfxdata="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" strokecolor="black [3213]">
+              <v:shape w14:anchorId="2D94F80F" id="Straight Arrow Connector 120" o:spid="_x0000_s1026" type="#_x0000_t32" style="position:absolute;margin-left:294pt;margin-top:17.55pt;width:0;height:20.2pt;z-index:251634688;visibility:visible;mso-wrap-style:square;mso-wrap-distance-left:9pt;mso-wrap-distance-top:0;mso-wrap-distance-right:9pt;mso-wrap-distance-bottom:0;mso-position-horizontal:absolute;mso-position-horizontal-relative:text;mso-position-vertical:absolute;mso-position-vertical-relative:text" o:gfxdata="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" strokecolor="black [3213]">
                 <v:stroke endarrow="block"/>
               </v:shape>
             </w:pict>
@@ -3452,6 +3460,7 @@
         <w:jc w:val="center"/>
       </w:pPr>
       <w:r>
+        <w:lastRenderedPageBreak/>
         <w:t>Analyze Insights</w:t>
       </w:r>
     </w:p>
@@ -3526,7 +3535,7 @@
           </mc:Choice>
           <mc:Fallback>
             <w:pict>
-              <v:shape w14:anchorId="055C83D7" id="Straight Arrow Connector 120" o:spid="_x0000_s1026" type="#_x0000_t32" style="position:absolute;margin-left:294pt;margin-top:.85pt;width:0;height:20.2pt;z-index:251636736;visibility:visible;mso-wrap-style:square;mso-wrap-distance-left:9pt;mso-wrap-distance-top:0;mso-wrap-distance-right:9pt;mso-wrap-distance-bottom:0;mso-position-horizontal:absolute;mso-position-horizontal-relative:text;mso-position-vertical:absolute;mso-position-vertical-relative:text" o:gfxdata="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" strokecolor="black [3213]">
+              <v:shape w14:anchorId="57ACD4B3" id="Straight Arrow Connector 120" o:spid="_x0000_s1026" type="#_x0000_t32" style="position:absolute;margin-left:294pt;margin-top:.85pt;width:0;height:20.2pt;z-index:251636736;visibility:visible;mso-wrap-style:square;mso-wrap-distance-left:9pt;mso-wrap-distance-top:0;mso-wrap-distance-right:9pt;mso-wrap-distance-bottom:0;mso-position-horizontal:absolute;mso-position-horizontal-relative:text;mso-position-vertical:absolute;mso-position-vertical-relative:text" o:gfxdata="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" strokecolor="black [3213]">
                 <v:stroke endarrow="block"/>
               </v:shape>
             </w:pict>
@@ -3618,7 +3627,7 @@
           </mc:Choice>
           <mc:Fallback>
             <w:pict>
-              <v:shape w14:anchorId="3F2FBCDF" id="Straight Arrow Connector 120" o:spid="_x0000_s1026" type="#_x0000_t32" style="position:absolute;margin-left:292.9pt;margin-top:1.95pt;width:0;height:20.2pt;z-index:251638784;visibility:visible;mso-wrap-style:square;mso-wrap-distance-left:9pt;mso-wrap-distance-top:0;mso-wrap-distance-right:9pt;mso-wrap-distance-bottom:0;mso-position-horizontal:absolute;mso-position-horizontal-relative:text;mso-position-vertical:absolute;mso-position-vertical-relative:text" o:gfxdata="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" strokecolor="black [3213]">
+              <v:shape w14:anchorId="3B63BC79" id="Straight Arrow Connector 120" o:spid="_x0000_s1026" type="#_x0000_t32" style="position:absolute;margin-left:292.9pt;margin-top:1.95pt;width:0;height:20.2pt;z-index:251638784;visibility:visible;mso-wrap-style:square;mso-wrap-distance-left:9pt;mso-wrap-distance-top:0;mso-wrap-distance-right:9pt;mso-wrap-distance-bottom:0;mso-position-horizontal:absolute;mso-position-horizontal-relative:text;mso-position-vertical:absolute;mso-position-vertical-relative:text" o:gfxdata="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" strokecolor="black [3213]">
                 <v:stroke endarrow="block"/>
               </v:shape>
             </w:pict>
@@ -6070,7 +6079,7 @@
           </mc:Choice>
           <mc:Fallback>
             <w:pict>
-              <v:shape w14:anchorId="2D2C5490" id="Graphic 5" o:spid="_x0000_s1026" style="position:absolute;margin-left:36pt;margin-top:277.6pt;width:540.1pt;height:.85pt;z-index:-251694080;visibility:visible;mso-wrap-style:square;mso-wrap-distance-left:0;mso-wrap-distance-top:0;mso-wrap-distance-right:0;mso-wrap-distance-bottom:0;mso-position-horizontal:absolute;mso-position-horizontal-relative:page;mso-position-vertical:absolute;mso-position-vertical-relative:text;v-text-anchor:top" coordsize="6859270,10795" o:gfxdata="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" path="m6859270,l,,,10667r6859270,l6859270,xe" fillcolor="black" stroked="f">
+              <v:shape w14:anchorId="58B19C44" id="Graphic 5" o:spid="_x0000_s1026" style="position:absolute;margin-left:36pt;margin-top:277.6pt;width:540.1pt;height:.85pt;z-index:-251694080;visibility:visible;mso-wrap-style:square;mso-wrap-distance-left:0;mso-wrap-distance-top:0;mso-wrap-distance-right:0;mso-wrap-distance-bottom:0;mso-position-horizontal:absolute;mso-position-horizontal-relative:page;mso-position-vertical:absolute;mso-position-vertical-relative:text;v-text-anchor:top" coordsize="6859270,10795" o:gfxdata="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" path="m6859270,l,,,10667r6859270,l6859270,xe" fillcolor="black" stroked="f">
                 <v:path arrowok="t"/>
                 <w10:wrap type="topAndBottom" anchorx="page"/>
               </v:shape>
@@ -6787,7 +6796,7 @@
           </mc:Choice>
           <mc:Fallback>
             <w:pict>
-              <v:group w14:anchorId="4296CB9C" id="Group 6" o:spid="_x0000_s1026" style="position:absolute;margin-left:54pt;margin-top:12.95pt;width:522.1pt;height:1.6pt;z-index:-15726080;mso-wrap-distance-left:0;mso-wrap-distance-right:0;mso-position-horizontal-relative:page" coordsize="66306,203" o:gfxdata="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">
+              <v:group w14:anchorId="1D196BC3" id="Group 6" o:spid="_x0000_s1026" style="position:absolute;margin-left:54pt;margin-top:12.95pt;width:522.1pt;height:1.6pt;z-index:-15726080;mso-wrap-distance-left:0;mso-wrap-distance-right:0;mso-position-horizontal-relative:page" coordsize="66306,203" o:gfxdata="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">
                 <v:shape id="Graphic 7" o:spid="_x0000_s1027" style="position:absolute;width:66294;height:203;visibility:visible;mso-wrap-style:square;v-text-anchor:top" coordsize="6629400,20320" o:gfxdata="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" path="m6629400,l,,,508,,3556,,20320r6629400,l6629400,xe" fillcolor="#9f9f9f" stroked="f">
                   <v:path arrowok="t"/>
                 </v:shape>
@@ -7490,7 +7499,7 @@
           </mc:Choice>
           <mc:Fallback>
             <w:pict>
-              <v:group w14:anchorId="3FC00D34" id="Group 13" o:spid="_x0000_s1026" style="position:absolute;margin-left:54pt;margin-top:12.8pt;width:522.1pt;height:1.65pt;z-index:-15725568;mso-wrap-distance-left:0;mso-wrap-distance-right:0;mso-position-horizontal-relative:page" coordsize="66306,209" o:gfxdata="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">
+              <v:group w14:anchorId="18E339C9" id="Group 13" o:spid="_x0000_s1026" style="position:absolute;margin-left:54pt;margin-top:12.8pt;width:522.1pt;height:1.65pt;z-index:-15725568;mso-wrap-distance-left:0;mso-wrap-distance-right:0;mso-position-horizontal-relative:page" coordsize="66306,209" o:gfxdata="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">
                 <v:shape id="Graphic 14" o:spid="_x0000_s1027" style="position:absolute;width:66294;height:203;visibility:visible;mso-wrap-style:square;v-text-anchor:top" coordsize="6629400,20320" o:gfxdata="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" path="m6629400,l,,,901,,3937,,20320r6629400,l6629400,xe" fillcolor="#9f9f9f" stroked="f">
                   <v:path arrowok="t"/>
                 </v:shape>
@@ -8125,7 +8134,7 @@
           </mc:Choice>
           <mc:Fallback>
             <w:pict>
-              <v:group w14:anchorId="1935901F" id="Group 20" o:spid="_x0000_s1026" style="position:absolute;margin-left:54pt;margin-top:12.85pt;width:522.1pt;height:1.65pt;z-index:-15725056;mso-wrap-distance-left:0;mso-wrap-distance-right:0;mso-position-horizontal-relative:page" coordsize="66306,209" o:gfxdata="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">
+              <v:group w14:anchorId="1B1153AA" id="Group 20" o:spid="_x0000_s1026" style="position:absolute;margin-left:54pt;margin-top:12.85pt;width:522.1pt;height:1.65pt;z-index:-15725056;mso-wrap-distance-left:0;mso-wrap-distance-right:0;mso-position-horizontal-relative:page" coordsize="66306,209" o:gfxdata="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">
                 <v:shape id="Graphic 21" o:spid="_x0000_s1027" style="position:absolute;width:66294;height:196;visibility:visible;mso-wrap-style:square;v-text-anchor:top" coordsize="6629400,19685" o:gfxdata="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" path="m6629400,l,,,774,,3810,,19685r6629400,l6629400,xe" fillcolor="#9f9f9f" stroked="f">
                   <v:path arrowok="t"/>
                 </v:shape>
@@ -8443,7 +8452,7 @@
           </mc:Choice>
           <mc:Fallback>
             <w:pict>
-              <v:shape w14:anchorId="60AFC488" id="Graphic 27" o:spid="_x0000_s1026" style="position:absolute;margin-left:54pt;margin-top:15pt;width:522.1pt;height:.85pt;z-index:-15724544;visibility:visible;mso-wrap-style:square;mso-wrap-distance-left:0;mso-wrap-distance-top:0;mso-wrap-distance-right:0;mso-wrap-distance-bottom:0;mso-position-horizontal:absolute;mso-position-horizontal-relative:page;mso-position-vertical:absolute;mso-position-vertical-relative:text;v-text-anchor:top" coordsize="6630670,10795" o:gfxdata="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" path="m6630670,l,,,10668r6630670,l6630670,xe" fillcolor="black" stroked="f">
+              <v:shape w14:anchorId="1226B748" id="Graphic 27" o:spid="_x0000_s1026" style="position:absolute;margin-left:54pt;margin-top:15pt;width:522.1pt;height:.85pt;z-index:-15724544;visibility:visible;mso-wrap-style:square;mso-wrap-distance-left:0;mso-wrap-distance-top:0;mso-wrap-distance-right:0;mso-wrap-distance-bottom:0;mso-position-horizontal:absolute;mso-position-horizontal-relative:page;mso-position-vertical:absolute;mso-position-vertical-relative:text;v-text-anchor:top" coordsize="6630670,10795" o:gfxdata="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" path="m6630670,l,,,10668r6630670,l6630670,xe" fillcolor="black" stroked="f">
                 <v:path arrowok="t"/>
                 <w10:wrap type="topAndBottom" anchorx="page"/>
               </v:shape>
@@ -9290,7 +9299,7 @@
           </mc:Choice>
           <mc:Fallback>
             <w:pict>
-              <v:group w14:anchorId="3E419DA9" id="Group 29" o:spid="_x0000_s1026" style="position:absolute;margin-left:49.45pt;margin-top:10.55pt;width:490.7pt;height:1.6pt;z-index:-15723520;mso-wrap-distance-left:0;mso-wrap-distance-right:0;mso-position-horizontal-relative:page" coordsize="62318,203" o:gfxdata="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">
+              <v:group w14:anchorId="18AF9644" id="Group 29" o:spid="_x0000_s1026" style="position:absolute;margin-left:49.45pt;margin-top:10.55pt;width:490.7pt;height:1.6pt;z-index:-15723520;mso-wrap-distance-left:0;mso-wrap-distance-right:0;mso-position-horizontal-relative:page" coordsize="62318,203" o:gfxdata="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">
                 <v:shape id="Graphic 30" o:spid="_x0000_s1027" style="position:absolute;width:62306;height:196;visibility:visible;mso-wrap-style:square;v-text-anchor:top" coordsize="6230620,19685" o:gfxdata="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" path="m6230112,l127,,,114,,3162r127,l127,19672r6229985,l6230112,xe" fillcolor="#9f9f9f" stroked="f">
                   <v:path arrowok="t"/>
                 </v:shape>
@@ -10224,7 +10233,7 @@
           </mc:Choice>
           <mc:Fallback>
             <w:pict>
-              <v:group w14:anchorId="4E0A8DE1" id="Group 36" o:spid="_x0000_s1026" style="position:absolute;margin-left:49.45pt;margin-top:10.55pt;width:490.7pt;height:1.65pt;z-index:-15723008;mso-wrap-distance-left:0;mso-wrap-distance-right:0;mso-position-horizontal-relative:page" coordsize="62318,209" o:gfxdata="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">
+              <v:group w14:anchorId="29421AF1" id="Group 36" o:spid="_x0000_s1026" style="position:absolute;margin-left:49.45pt;margin-top:10.55pt;width:490.7pt;height:1.65pt;z-index:-15723008;mso-wrap-distance-left:0;mso-wrap-distance-right:0;mso-position-horizontal-relative:page" coordsize="62318,209" o:gfxdata="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">
                 <v:shape id="Graphic 37" o:spid="_x0000_s1027" style="position:absolute;width:62306;height:196;visibility:visible;mso-wrap-style:square;v-text-anchor:top" coordsize="6230620,19685" o:gfxdata="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" path="m6230112,l127,r,635l,635,,3683r127,l127,19685r6229985,l6230112,xe" fillcolor="#9f9f9f" stroked="f">
                   <v:path arrowok="t"/>
                 </v:shape>
@@ -10365,7 +10374,7 @@
           </mc:Choice>
           <mc:Fallback>
             <w:pict>
-              <v:shape w14:anchorId="7ECACA09" id="Straight Arrow Connector 122" o:spid="_x0000_s1026" type="#_x0000_t32" style="position:absolute;margin-left:97.4pt;margin-top:13.1pt;width:0;height:19.85pt;z-index:487612416;visibility:visible;mso-wrap-style:square;mso-wrap-distance-left:9pt;mso-wrap-distance-top:0;mso-wrap-distance-right:9pt;mso-wrap-distance-bottom:0;mso-position-horizontal:absolute;mso-position-horizontal-relative:text;mso-position-vertical:absolute;mso-position-vertical-relative:text" o:gfxdata="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" strokecolor="black [3213]">
+              <v:shape w14:anchorId="2469BA12" id="Straight Arrow Connector 122" o:spid="_x0000_s1026" type="#_x0000_t32" style="position:absolute;margin-left:97.4pt;margin-top:13.1pt;width:0;height:19.85pt;z-index:487612416;visibility:visible;mso-wrap-style:square;mso-wrap-distance-left:9pt;mso-wrap-distance-top:0;mso-wrap-distance-right:9pt;mso-wrap-distance-bottom:0;mso-position-horizontal:absolute;mso-position-horizontal-relative:text;mso-position-vertical:absolute;mso-position-vertical-relative:text" o:gfxdata="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" strokecolor="black [3213]">
                 <v:stroke endarrow="block"/>
               </v:shape>
             </w:pict>
@@ -10480,7 +10489,7 @@
           </mc:Choice>
           <mc:Fallback>
             <w:pict>
-              <v:shape w14:anchorId="1B707968" id="Straight Arrow Connector 122" o:spid="_x0000_s1026" type="#_x0000_t32" style="position:absolute;margin-left:101.05pt;margin-top:14.6pt;width:0;height:19.8pt;z-index:251667456;visibility:visible;mso-wrap-style:square;mso-wrap-distance-left:9pt;mso-wrap-distance-top:0;mso-wrap-distance-right:9pt;mso-wrap-distance-bottom:0;mso-position-horizontal:absolute;mso-position-horizontal-relative:text;mso-position-vertical:absolute;mso-position-vertical-relative:text" o:gfxdata="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" strokecolor="black [3213]">
+              <v:shape w14:anchorId="265C7701" id="Straight Arrow Connector 122" o:spid="_x0000_s1026" type="#_x0000_t32" style="position:absolute;margin-left:101.05pt;margin-top:14.6pt;width:0;height:19.8pt;z-index:251667456;visibility:visible;mso-wrap-style:square;mso-wrap-distance-left:9pt;mso-wrap-distance-top:0;mso-wrap-distance-right:9pt;mso-wrap-distance-bottom:0;mso-position-horizontal:absolute;mso-position-horizontal-relative:text;mso-position-vertical:absolute;mso-position-vertical-relative:text" o:gfxdata="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" strokecolor="black [3213]">
                 <v:stroke endarrow="block"/>
               </v:shape>
             </w:pict>
@@ -10589,7 +10598,7 @@
           </mc:Choice>
           <mc:Fallback>
             <w:pict>
-              <v:shape w14:anchorId="134E5AFE" id="Straight Arrow Connector 124" o:spid="_x0000_s1026" type="#_x0000_t32" style="position:absolute;margin-left:105.7pt;margin-top:14.3pt;width:0;height:15.25pt;z-index:251671552;visibility:visible;mso-wrap-style:square;mso-wrap-distance-left:9pt;mso-wrap-distance-top:0;mso-wrap-distance-right:9pt;mso-wrap-distance-bottom:0;mso-position-horizontal:absolute;mso-position-horizontal-relative:text;mso-position-vertical:absolute;mso-position-vertical-relative:text" o:gfxdata="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" strokecolor="black [3213]">
+              <v:shape w14:anchorId="2608FB91" id="Straight Arrow Connector 124" o:spid="_x0000_s1026" type="#_x0000_t32" style="position:absolute;margin-left:105.7pt;margin-top:14.3pt;width:0;height:15.25pt;z-index:251671552;visibility:visible;mso-wrap-style:square;mso-wrap-distance-left:9pt;mso-wrap-distance-top:0;mso-wrap-distance-right:9pt;mso-wrap-distance-bottom:0;mso-position-horizontal:absolute;mso-position-horizontal-relative:text;mso-position-vertical:absolute;mso-position-vertical-relative:text" o:gfxdata="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" strokecolor="black [3213]">
                 <v:stroke endarrow="block"/>
               </v:shape>
             </w:pict>
@@ -10696,7 +10705,7 @@
           </mc:Choice>
           <mc:Fallback>
             <w:pict>
-              <v:shape w14:anchorId="2B343BCD" id="Straight Arrow Connector 124" o:spid="_x0000_s1026" type="#_x0000_t32" style="position:absolute;margin-left:47.05pt;margin-top:.4pt;width:0;height:15.2pt;z-index:251674624;visibility:visible;mso-wrap-style:square;mso-wrap-distance-left:9pt;mso-wrap-distance-top:0;mso-wrap-distance-right:9pt;mso-wrap-distance-bottom:0;mso-position-horizontal:absolute;mso-position-horizontal-relative:text;mso-position-vertical:absolute;mso-position-vertical-relative:text" o:gfxdata="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" strokecolor="black [3213]">
+              <v:shape w14:anchorId="2E21989F" id="Straight Arrow Connector 124" o:spid="_x0000_s1026" type="#_x0000_t32" style="position:absolute;margin-left:47.05pt;margin-top:.4pt;width:0;height:15.2pt;z-index:251674624;visibility:visible;mso-wrap-style:square;mso-wrap-distance-left:9pt;mso-wrap-distance-top:0;mso-wrap-distance-right:9pt;mso-wrap-distance-bottom:0;mso-position-horizontal:absolute;mso-position-horizontal-relative:text;mso-position-vertical:absolute;mso-position-vertical-relative:text" o:gfxdata="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" strokecolor="black [3213]">
                 <v:stroke endarrow="block"/>
               </v:shape>
             </w:pict>
@@ -10766,7 +10775,7 @@
           </mc:Choice>
           <mc:Fallback>
             <w:pict>
-              <v:shape w14:anchorId="26E62DAA" id="Straight Arrow Connector 124" o:spid="_x0000_s1026" type="#_x0000_t32" style="position:absolute;margin-left:217.85pt;margin-top:.65pt;width:0;height:15.25pt;z-index:251684864;visibility:visible;mso-wrap-style:square;mso-wrap-distance-left:9pt;mso-wrap-distance-top:0;mso-wrap-distance-right:9pt;mso-wrap-distance-bottom:0;mso-position-horizontal:absolute;mso-position-horizontal-relative:text;mso-position-vertical:absolute;mso-position-vertical-relative:text" o:gfxdata="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" strokecolor="black [3213]">
+              <v:shape w14:anchorId="18C98851" id="Straight Arrow Connector 124" o:spid="_x0000_s1026" type="#_x0000_t32" style="position:absolute;margin-left:217.85pt;margin-top:.65pt;width:0;height:15.25pt;z-index:251684864;visibility:visible;mso-wrap-style:square;mso-wrap-distance-left:9pt;mso-wrap-distance-top:0;mso-wrap-distance-right:9pt;mso-wrap-distance-bottom:0;mso-position-horizontal:absolute;mso-position-horizontal-relative:text;mso-position-vertical:absolute;mso-position-vertical-relative:text" o:gfxdata="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" strokecolor="black [3213]">
                 <v:stroke endarrow="block"/>
               </v:shape>
             </w:pict>
@@ -10836,7 +10845,7 @@
           </mc:Choice>
           <mc:Fallback>
             <w:pict>
-              <v:shape w14:anchorId="1BDA1208" id="Straight Arrow Connector 124" o:spid="_x0000_s1026" type="#_x0000_t32" style="position:absolute;margin-left:148.15pt;margin-top:.5pt;width:0;height:15.25pt;z-index:251679744;visibility:visible;mso-wrap-style:square;mso-wrap-distance-left:9pt;mso-wrap-distance-top:0;mso-wrap-distance-right:9pt;mso-wrap-distance-bottom:0;mso-position-horizontal:absolute;mso-position-horizontal-relative:text;mso-position-vertical:absolute;mso-position-vertical-relative:text" o:gfxdata="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" strokecolor="black [3213]">
+              <v:shape w14:anchorId="1BD726B3" id="Straight Arrow Connector 124" o:spid="_x0000_s1026" type="#_x0000_t32" style="position:absolute;margin-left:148.15pt;margin-top:.5pt;width:0;height:15.25pt;z-index:251679744;visibility:visible;mso-wrap-style:square;mso-wrap-distance-left:9pt;mso-wrap-distance-top:0;mso-wrap-distance-right:9pt;mso-wrap-distance-bottom:0;mso-position-horizontal:absolute;mso-position-horizontal-relative:text;mso-position-vertical:absolute;mso-position-vertical-relative:text" o:gfxdata="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" strokecolor="black [3213]">
                 <v:stroke endarrow="block"/>
               </v:shape>
             </w:pict>
@@ -10905,7 +10914,7 @@
           </mc:Choice>
           <mc:Fallback>
             <w:pict>
-              <v:line w14:anchorId="488810DA" id="Straight Connector 123" o:spid="_x0000_s1026" style="position:absolute;z-index:251668480;visibility:visible;mso-wrap-style:square;mso-wrap-distance-left:9pt;mso-wrap-distance-top:0;mso-wrap-distance-right:9pt;mso-wrap-distance-bottom:0;mso-position-horizontal:absolute;mso-position-horizontal-relative:text;mso-position-vertical:absolute;mso-position-vertical-relative:text" from="47.1pt,.25pt" to="217.85pt,.25pt" o:gfxdata="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" strokecolor="black [3213]"/>
+              <v:line w14:anchorId="65767083" id="Straight Connector 123" o:spid="_x0000_s1026" style="position:absolute;z-index:251668480;visibility:visible;mso-wrap-style:square;mso-wrap-distance-left:9pt;mso-wrap-distance-top:0;mso-wrap-distance-right:9pt;mso-wrap-distance-bottom:0;mso-position-horizontal:absolute;mso-position-horizontal-relative:text;mso-position-vertical:absolute;mso-position-vertical-relative:text" from="47.1pt,.25pt" to="217.85pt,.25pt" o:gfxdata="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" strokecolor="black [3213]"/>
             </w:pict>
           </mc:Fallback>
         </mc:AlternateContent>
@@ -10997,7 +11006,7 @@
           </mc:Choice>
           <mc:Fallback>
             <w:pict>
-              <v:shape w14:anchorId="003E2F4B" id="Straight Arrow Connector 124" o:spid="_x0000_s1026" type="#_x0000_t32" style="position:absolute;margin-left:217.4pt;margin-top:14pt;width:0;height:15.25pt;z-index:251705344;visibility:visible;mso-wrap-style:square;mso-wrap-distance-left:9pt;mso-wrap-distance-top:0;mso-wrap-distance-right:9pt;mso-wrap-distance-bottom:0;mso-position-horizontal:absolute;mso-position-horizontal-relative:text;mso-position-vertical:absolute;mso-position-vertical-relative:text" o:gfxdata="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" strokecolor="black [3213]">
+              <v:shape w14:anchorId="22E470D0" id="Straight Arrow Connector 124" o:spid="_x0000_s1026" type="#_x0000_t32" style="position:absolute;margin-left:217.4pt;margin-top:14pt;width:0;height:15.25pt;z-index:251705344;visibility:visible;mso-wrap-style:square;mso-wrap-distance-left:9pt;mso-wrap-distance-top:0;mso-wrap-distance-right:9pt;mso-wrap-distance-bottom:0;mso-position-horizontal:absolute;mso-position-horizontal-relative:text;mso-position-vertical:absolute;mso-position-vertical-relative:text" o:gfxdata="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" strokecolor="black [3213]">
                 <v:stroke endarrow="block"/>
               </v:shape>
             </w:pict>
@@ -11067,7 +11076,7 @@
           </mc:Choice>
           <mc:Fallback>
             <w:pict>
-              <v:shape w14:anchorId="09DE0D90" id="Straight Arrow Connector 124" o:spid="_x0000_s1026" type="#_x0000_t32" style="position:absolute;margin-left:144.45pt;margin-top:14.05pt;width:0;height:15.25pt;z-index:251703296;visibility:visible;mso-wrap-style:square;mso-wrap-distance-left:9pt;mso-wrap-distance-top:0;mso-wrap-distance-right:9pt;mso-wrap-distance-bottom:0;mso-position-horizontal:absolute;mso-position-horizontal-relative:text;mso-position-vertical:absolute;mso-position-vertical-relative:text" o:gfxdata="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" strokecolor="black [3213]">
+              <v:shape w14:anchorId="23C35CF4" id="Straight Arrow Connector 124" o:spid="_x0000_s1026" type="#_x0000_t32" style="position:absolute;margin-left:144.45pt;margin-top:14.05pt;width:0;height:15.25pt;z-index:251703296;visibility:visible;mso-wrap-style:square;mso-wrap-distance-left:9pt;mso-wrap-distance-top:0;mso-wrap-distance-right:9pt;mso-wrap-distance-bottom:0;mso-position-horizontal:absolute;mso-position-horizontal-relative:text;mso-position-vertical:absolute;mso-position-vertical-relative:text" o:gfxdata="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" strokecolor="black [3213]">
                 <v:stroke endarrow="block"/>
               </v:shape>
             </w:pict>
@@ -11137,7 +11146,7 @@
           </mc:Choice>
           <mc:Fallback>
             <w:pict>
-              <v:shape w14:anchorId="77832B7D" id="Straight Arrow Connector 124" o:spid="_x0000_s1026" type="#_x0000_t32" style="position:absolute;margin-left:47.05pt;margin-top:13.8pt;width:0;height:15.2pt;z-index:251698176;visibility:visible;mso-wrap-style:square;mso-wrap-distance-left:9pt;mso-wrap-distance-top:0;mso-wrap-distance-right:9pt;mso-wrap-distance-bottom:0;mso-position-horizontal:absolute;mso-position-horizontal-relative:text;mso-position-vertical:absolute;mso-position-vertical-relative:text" o:gfxdata="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" strokecolor="black [3213]">
+              <v:shape w14:anchorId="4A149C69" id="Straight Arrow Connector 124" o:spid="_x0000_s1026" type="#_x0000_t32" style="position:absolute;margin-left:47.05pt;margin-top:13.8pt;width:0;height:15.2pt;z-index:251698176;visibility:visible;mso-wrap-style:square;mso-wrap-distance-left:9pt;mso-wrap-distance-top:0;mso-wrap-distance-right:9pt;mso-wrap-distance-bottom:0;mso-position-horizontal:absolute;mso-position-horizontal-relative:text;mso-position-vertical:absolute;mso-position-vertical-relative:text" o:gfxdata="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" strokecolor="black [3213]">
                 <v:stroke endarrow="block"/>
               </v:shape>
             </w:pict>
@@ -11268,7 +11277,7 @@
           </mc:Choice>
           <mc:Fallback>
             <w:pict>
-              <v:shape w14:anchorId="2A029CBB" id="Straight Arrow Connector 124" o:spid="_x0000_s1026" type="#_x0000_t32" style="position:absolute;margin-left:107.55pt;margin-top:14.6pt;width:0;height:15.25pt;z-index:251707392;visibility:visible;mso-wrap-style:square;mso-wrap-distance-left:9pt;mso-wrap-distance-top:0;mso-wrap-distance-right:9pt;mso-wrap-distance-bottom:0;mso-position-horizontal:absolute;mso-position-horizontal-relative:text;mso-position-vertical:absolute;mso-position-vertical-relative:text" o:gfxdata="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" strokecolor="black [3213]">
+              <v:shape w14:anchorId="69B58940" id="Straight Arrow Connector 124" o:spid="_x0000_s1026" type="#_x0000_t32" style="position:absolute;margin-left:107.55pt;margin-top:14.6pt;width:0;height:15.25pt;z-index:251707392;visibility:visible;mso-wrap-style:square;mso-wrap-distance-left:9pt;mso-wrap-distance-top:0;mso-wrap-distance-right:9pt;mso-wrap-distance-bottom:0;mso-position-horizontal:absolute;mso-position-horizontal-relative:text;mso-position-vertical:absolute;mso-position-vertical-relative:text" o:gfxdata="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" strokecolor="black [3213]">
                 <v:stroke endarrow="block"/>
               </v:shape>
             </w:pict>
@@ -11337,7 +11346,7 @@
           </mc:Choice>
           <mc:Fallback>
             <w:pict>
-              <v:line w14:anchorId="7E0D4F0C" id="Straight Connector 123" o:spid="_x0000_s1026" style="position:absolute;z-index:251693056;visibility:visible;mso-wrap-style:square;mso-wrap-distance-left:9pt;mso-wrap-distance-top:0;mso-wrap-distance-right:9pt;mso-wrap-distance-bottom:0;mso-position-horizontal:absolute;mso-position-horizontal-relative:text;mso-position-vertical:absolute;mso-position-vertical-relative:text" from="47.1pt,14.6pt" to="217.85pt,14.6pt" o:gfxdata="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" strokecolor="black [3213]"/>
+              <v:line w14:anchorId="44DE264F" id="Straight Connector 123" o:spid="_x0000_s1026" style="position:absolute;z-index:251693056;visibility:visible;mso-wrap-style:square;mso-wrap-distance-left:9pt;mso-wrap-distance-top:0;mso-wrap-distance-right:9pt;mso-wrap-distance-bottom:0;mso-position-horizontal:absolute;mso-position-horizontal-relative:text;mso-position-vertical:absolute;mso-position-vertical-relative:text" from="47.1pt,14.6pt" to="217.85pt,14.6pt" o:gfxdata="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" strokecolor="black [3213]"/>
             </w:pict>
           </mc:Fallback>
         </mc:AlternateContent>
@@ -11444,7 +11453,7 @@
           </mc:Choice>
           <mc:Fallback>
             <w:pict>
-              <v:shape w14:anchorId="14E583CF" id="Straight Arrow Connector 124" o:spid="_x0000_s1026" type="#_x0000_t32" style="position:absolute;margin-left:94.6pt;margin-top:14.1pt;width:0;height:15.25pt;z-index:251709440;visibility:visible;mso-wrap-style:square;mso-wrap-distance-left:9pt;mso-wrap-distance-top:0;mso-wrap-distance-right:9pt;mso-wrap-distance-bottom:0;mso-position-horizontal:absolute;mso-position-horizontal-relative:text;mso-position-vertical:absolute;mso-position-vertical-relative:text" o:gfxdata="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" strokecolor="black [3213]">
+              <v:shape w14:anchorId="36A6A793" id="Straight Arrow Connector 124" o:spid="_x0000_s1026" type="#_x0000_t32" style="position:absolute;margin-left:94.6pt;margin-top:14.1pt;width:0;height:15.25pt;z-index:251709440;visibility:visible;mso-wrap-style:square;mso-wrap-distance-left:9pt;mso-wrap-distance-top:0;mso-wrap-distance-right:9pt;mso-wrap-distance-bottom:0;mso-position-horizontal:absolute;mso-position-horizontal-relative:text;mso-position-vertical:absolute;mso-position-vertical-relative:text" o:gfxdata="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" strokecolor="black [3213]">
                 <v:stroke endarrow="block"/>
               </v:shape>
             </w:pict>
@@ -11553,7 +11562,7 @@
           </mc:Choice>
           <mc:Fallback>
             <w:pict>
-              <v:shape w14:anchorId="318D957A" id="Straight Arrow Connector 124" o:spid="_x0000_s1026" type="#_x0000_t32" style="position:absolute;margin-left:94.6pt;margin-top:14.1pt;width:0;height:15.2pt;z-index:251711488;visibility:visible;mso-wrap-style:square;mso-wrap-distance-left:9pt;mso-wrap-distance-top:0;mso-wrap-distance-right:9pt;mso-wrap-distance-bottom:0;mso-position-horizontal:absolute;mso-position-horizontal-relative:text;mso-position-vertical:absolute;mso-position-vertical-relative:text" o:gfxdata="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" strokecolor="black [3213]">
+              <v:shape w14:anchorId="4F4B952F" id="Straight Arrow Connector 124" o:spid="_x0000_s1026" type="#_x0000_t32" style="position:absolute;margin-left:94.6pt;margin-top:14.1pt;width:0;height:15.2pt;z-index:251711488;visibility:visible;mso-wrap-style:square;mso-wrap-distance-left:9pt;mso-wrap-distance-top:0;mso-wrap-distance-right:9pt;mso-wrap-distance-bottom:0;mso-position-horizontal:absolute;mso-position-horizontal-relative:text;mso-position-vertical:absolute;mso-position-vertical-relative:text" o:gfxdata="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" strokecolor="black [3213]">
                 <v:stroke endarrow="block"/>
               </v:shape>
             </w:pict>
@@ -11647,7 +11656,7 @@
           </mc:Choice>
           <mc:Fallback>
             <w:pict>
-              <v:shape w14:anchorId="6586ED06" id="Straight Arrow Connector 124" o:spid="_x0000_s1026" type="#_x0000_t32" style="position:absolute;margin-left:94.6pt;margin-top:14.1pt;width:0;height:15.25pt;z-index:251713536;visibility:visible;mso-wrap-style:square;mso-wrap-distance-left:9pt;mso-wrap-distance-top:0;mso-wrap-distance-right:9pt;mso-wrap-distance-bottom:0;mso-position-horizontal:absolute;mso-position-horizontal-relative:text;mso-position-vertical:absolute;mso-position-vertical-relative:text" o:gfxdata="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" strokecolor="black [3213]">
+              <v:shape w14:anchorId="3A64F4D4" id="Straight Arrow Connector 124" o:spid="_x0000_s1026" type="#_x0000_t32" style="position:absolute;margin-left:94.6pt;margin-top:14.1pt;width:0;height:15.25pt;z-index:251713536;visibility:visible;mso-wrap-style:square;mso-wrap-distance-left:9pt;mso-wrap-distance-top:0;mso-wrap-distance-right:9pt;mso-wrap-distance-bottom:0;mso-position-horizontal:absolute;mso-position-horizontal-relative:text;mso-position-vertical:absolute;mso-position-vertical-relative:text" o:gfxdata="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" strokecolor="black [3213]">
                 <v:stroke endarrow="block"/>
               </v:shape>
             </w:pict>
@@ -12325,7 +12334,7 @@
           </mc:Choice>
           <mc:Fallback>
             <w:pict>
-              <v:shape w14:anchorId="1A854C53" id="Graphic 43" o:spid="_x0000_s1026" style="position:absolute;margin-left:40.45pt;margin-top:12.75pt;width:535.7pt;height:.85pt;z-index:-15722496;visibility:visible;mso-wrap-style:square;mso-wrap-distance-left:0;mso-wrap-distance-top:0;mso-wrap-distance-right:0;mso-wrap-distance-bottom:0;mso-position-horizontal:absolute;mso-position-horizontal-relative:page;mso-position-vertical:absolute;mso-position-vertical-relative:text;v-text-anchor:top" coordsize="6803390,10795" o:gfxdata="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" path="m6802881,l,,,10668r6802881,l6802881,xe" fillcolor="black" stroked="f">
+              <v:shape w14:anchorId="7B2DE860" id="Graphic 43" o:spid="_x0000_s1026" style="position:absolute;margin-left:40.45pt;margin-top:12.75pt;width:535.7pt;height:.85pt;z-index:-15722496;visibility:visible;mso-wrap-style:square;mso-wrap-distance-left:0;mso-wrap-distance-top:0;mso-wrap-distance-right:0;mso-wrap-distance-bottom:0;mso-position-horizontal:absolute;mso-position-horizontal-relative:page;mso-position-vertical:absolute;mso-position-vertical-relative:text;v-text-anchor:top" coordsize="6803390,10795" o:gfxdata="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" path="m6802881,l,,,10668r6802881,l6802881,xe" fillcolor="black" stroked="f">
                 <v:path arrowok="t"/>
                 <w10:wrap type="topAndBottom" anchorx="page"/>
               </v:shape>
@@ -13833,7 +13842,7 @@
           </mc:Choice>
           <mc:Fallback>
             <w:pict>
-              <v:shape w14:anchorId="143B5CBD" id="Graphic 44" o:spid="_x0000_s1026" style="position:absolute;margin-left:40.45pt;margin-top:12.85pt;width:535.7pt;height:.85pt;z-index:-15721984;visibility:visible;mso-wrap-style:square;mso-wrap-distance-left:0;mso-wrap-distance-top:0;mso-wrap-distance-right:0;mso-wrap-distance-bottom:0;mso-position-horizontal:absolute;mso-position-horizontal-relative:page;mso-position-vertical:absolute;mso-position-vertical-relative:text;v-text-anchor:top" coordsize="6803390,10795" o:gfxdata="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" path="m6802881,l,,,10667r6802881,l6802881,xe" fillcolor="black" stroked="f">
+              <v:shape w14:anchorId="7E96232F" id="Graphic 44" o:spid="_x0000_s1026" style="position:absolute;margin-left:40.45pt;margin-top:12.85pt;width:535.7pt;height:.85pt;z-index:-15721984;visibility:visible;mso-wrap-style:square;mso-wrap-distance-left:0;mso-wrap-distance-top:0;mso-wrap-distance-right:0;mso-wrap-distance-bottom:0;mso-position-horizontal:absolute;mso-position-horizontal-relative:page;mso-position-vertical:absolute;mso-position-vertical-relative:text;v-text-anchor:top" coordsize="6803390,10795" o:gfxdata="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" path="m6802881,l,,,10667r6802881,l6802881,xe" fillcolor="black" stroked="f">
                 <v:path arrowok="t"/>
                 <w10:wrap type="topAndBottom" anchorx="page"/>
               </v:shape>
@@ -14692,7 +14701,7 @@
           </mc:Choice>
           <mc:Fallback>
             <w:pict>
-              <v:shape w14:anchorId="218C6C79" id="Graphic 45" o:spid="_x0000_s1026" style="position:absolute;margin-left:40.45pt;margin-top:12.7pt;width:535.7pt;height:.85pt;z-index:-15721472;visibility:visible;mso-wrap-style:square;mso-wrap-distance-left:0;mso-wrap-distance-top:0;mso-wrap-distance-right:0;mso-wrap-distance-bottom:0;mso-position-horizontal:absolute;mso-position-horizontal-relative:page;mso-position-vertical:absolute;mso-position-vertical-relative:text;v-text-anchor:top" coordsize="6803390,10795" o:gfxdata="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" path="m6802881,l,,,10668r6802881,l6802881,xe" fillcolor="gray" stroked="f">
+              <v:shape w14:anchorId="192295E6" id="Graphic 45" o:spid="_x0000_s1026" style="position:absolute;margin-left:40.45pt;margin-top:12.7pt;width:535.7pt;height:.85pt;z-index:-15721472;visibility:visible;mso-wrap-style:square;mso-wrap-distance-left:0;mso-wrap-distance-top:0;mso-wrap-distance-right:0;mso-wrap-distance-bottom:0;mso-position-horizontal:absolute;mso-position-horizontal-relative:page;mso-position-vertical:absolute;mso-position-vertical-relative:text;v-text-anchor:top" coordsize="6803390,10795" o:gfxdata="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" path="m6802881,l,,,10668r6802881,l6802881,xe" fillcolor="gray" stroked="f">
                 <v:path arrowok="t"/>
                 <w10:wrap type="topAndBottom" anchorx="page"/>
               </v:shape>
@@ -15482,7 +15491,7 @@
           </mc:Choice>
           <mc:Fallback>
             <w:pict>
-              <v:group w14:anchorId="18EC7539" id="Group 46" o:spid="_x0000_s1026" style="position:absolute;margin-left:40.45pt;margin-top:10.6pt;width:544.7pt;height:1.6pt;z-index:-251673600;mso-wrap-distance-left:0;mso-wrap-distance-right:0;mso-position-horizontal-relative:page" coordsize="69176,203" o:gfxdata="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">
+              <v:group w14:anchorId="2EE45636" id="Group 46" o:spid="_x0000_s1026" style="position:absolute;margin-left:40.45pt;margin-top:10.6pt;width:544.7pt;height:1.6pt;z-index:-251673600;mso-wrap-distance-left:0;mso-wrap-distance-right:0;mso-position-horizontal-relative:page" coordsize="69176,203" o:gfxdata="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">
                 <v:shape id="Graphic 47" o:spid="_x0000_s1027" style="position:absolute;width:69164;height:203;visibility:visible;mso-wrap-style:square;v-text-anchor:top" coordsize="6916420,20320" o:gfxdata="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" path="m6915912,127r-1524,l6914388,,3048,,,,,3048r127,l127,19812r6915785,l6915912,127xe" fillcolor="#9f9f9f" stroked="f">
                   <v:path arrowok="t"/>
                 </v:shape>
@@ -16289,7 +16298,7 @@
           </mc:Choice>
           <mc:Fallback>
             <w:pict>
-              <v:group w14:anchorId="66CD6288" id="Group 53" o:spid="_x0000_s1026" style="position:absolute;margin-left:40.45pt;margin-top:10.6pt;width:544.7pt;height:1.6pt;z-index:-251669504;mso-wrap-distance-left:0;mso-wrap-distance-right:0;mso-position-horizontal-relative:page" coordsize="69176,203" o:gfxdata="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">
+              <v:group w14:anchorId="3F59D63C" id="Group 53" o:spid="_x0000_s1026" style="position:absolute;margin-left:40.45pt;margin-top:10.6pt;width:544.7pt;height:1.6pt;z-index:-251669504;mso-wrap-distance-left:0;mso-wrap-distance-right:0;mso-position-horizontal-relative:page" coordsize="69176,203" o:gfxdata="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">
                 <v:shape id="Graphic 54" o:spid="_x0000_s1027" style="position:absolute;width:69164;height:196;visibility:visible;mso-wrap-style:square;v-text-anchor:top" coordsize="6916420,19685" o:gfxdata="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" path="m6915912,l127,,,12,,3048r127,l127,19685r6915785,l6915912,xe" fillcolor="#9f9f9f" stroked="f">
                   <v:path arrowok="t"/>
                 </v:shape>
@@ -16547,7 +16556,7 @@
           </mc:Choice>
           <mc:Fallback>
             <w:pict>
-              <v:shape w14:anchorId="498EFA48" id="Graphic 60" o:spid="_x0000_s1026" style="position:absolute;margin-left:40.45pt;margin-top:12.8pt;width:535.7pt;height:.85pt;z-index:-251663360;visibility:visible;mso-wrap-style:square;mso-wrap-distance-left:0;mso-wrap-distance-top:0;mso-wrap-distance-right:0;mso-wrap-distance-bottom:0;mso-position-horizontal:absolute;mso-position-horizontal-relative:page;mso-position-vertical:absolute;mso-position-vertical-relative:text;v-text-anchor:top" coordsize="6803390,10795" o:gfxdata="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" path="m6802881,l,,,10668r6802881,l6802881,xe" fillcolor="black" stroked="f">
+              <v:shape w14:anchorId="7B4EC670" id="Graphic 60" o:spid="_x0000_s1026" style="position:absolute;margin-left:40.45pt;margin-top:12.8pt;width:535.7pt;height:.85pt;z-index:-251663360;visibility:visible;mso-wrap-style:square;mso-wrap-distance-left:0;mso-wrap-distance-top:0;mso-wrap-distance-right:0;mso-wrap-distance-bottom:0;mso-position-horizontal:absolute;mso-position-horizontal-relative:page;mso-position-vertical:absolute;mso-position-vertical-relative:text;v-text-anchor:top" coordsize="6803390,10795" o:gfxdata="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" path="m6802881,l,,,10668r6802881,l6802881,xe" fillcolor="black" stroked="f">
                 <v:path arrowok="t"/>
                 <w10:wrap type="topAndBottom" anchorx="page"/>
               </v:shape>
@@ -17239,7 +17248,7 @@
           </mc:Choice>
           <mc:Fallback>
             <w:pict>
-              <v:group w14:anchorId="6CFF37C5" id="Group 61" o:spid="_x0000_s1026" style="position:absolute;margin-left:40.45pt;margin-top:10.55pt;width:544.7pt;height:1.65pt;z-index:-251655168;mso-wrap-distance-left:0;mso-wrap-distance-right:0;mso-position-horizontal-relative:page" coordsize="69176,209" o:gfxdata="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">
+              <v:group w14:anchorId="676AFA96" id="Group 61" o:spid="_x0000_s1026" style="position:absolute;margin-left:40.45pt;margin-top:10.55pt;width:544.7pt;height:1.65pt;z-index:-251655168;mso-wrap-distance-left:0;mso-wrap-distance-right:0;mso-position-horizontal-relative:page" coordsize="69176,209" o:gfxdata="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">
                 <v:shape id="Graphic 62" o:spid="_x0000_s1027" style="position:absolute;width:69164;height:196;visibility:visible;mso-wrap-style:square;v-text-anchor:top" coordsize="6916420,19685" o:gfxdata="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" path="m6915912,l127,r,774l,774,,3810r127,l127,19685r6915785,l6915912,xe" fillcolor="#9f9f9f" stroked="f">
                   <v:path arrowok="t"/>
                 </v:shape>
@@ -17985,7 +17994,7 @@
           </mc:Choice>
           <mc:Fallback>
             <w:pict>
-              <v:group w14:anchorId="2C7D7CEC" id="Group 71" o:spid="_x0000_s1026" style="position:absolute;margin-left:40.45pt;margin-top:10.55pt;width:544.7pt;height:1.6pt;z-index:-15718400;mso-wrap-distance-left:0;mso-wrap-distance-right:0;mso-position-horizontal-relative:page" coordsize="69176,203" o:gfxdata="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">
+              <v:group w14:anchorId="4ECE0104" id="Group 71" o:spid="_x0000_s1026" style="position:absolute;margin-left:40.45pt;margin-top:10.55pt;width:544.7pt;height:1.6pt;z-index:-15718400;mso-wrap-distance-left:0;mso-wrap-distance-right:0;mso-position-horizontal-relative:page" coordsize="69176,203" o:gfxdata="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">
                 <v:shape id="Graphic 72" o:spid="_x0000_s1027" style="position:absolute;width:69164;height:203;visibility:visible;mso-wrap-style:square;v-text-anchor:top" coordsize="6916420,20320" o:gfxdata="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" path="m6915912,l127,r,508l,508,,3556r127,l127,20320r6915785,l6915912,xe" fillcolor="#9f9f9f" stroked="f">
                   <v:path arrowok="t"/>
                 </v:shape>
@@ -18627,7 +18636,7 @@
           </mc:Choice>
           <mc:Fallback>
             <w:pict>
-              <v:group w14:anchorId="6AB484DB" id="Group 81" o:spid="_x0000_s1026" style="position:absolute;margin-left:40.45pt;margin-top:10.45pt;width:544.7pt;height:1.7pt;z-index:-15717888;mso-wrap-distance-left:0;mso-wrap-distance-right:0;mso-position-horizontal-relative:page" coordsize="69176,215" o:gfxdata="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">
+              <v:group w14:anchorId="01DEDE97" id="Group 81" o:spid="_x0000_s1026" style="position:absolute;margin-left:40.45pt;margin-top:10.45pt;width:544.7pt;height:1.7pt;z-index:-15717888;mso-wrap-distance-left:0;mso-wrap-distance-right:0;mso-position-horizontal-relative:page" coordsize="69176,215" o:gfxdata="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">
                 <v:shape id="Graphic 82" o:spid="_x0000_s1027" style="position:absolute;width:69164;height:196;visibility:visible;mso-wrap-style:square;v-text-anchor:top" coordsize="6916420,19685" o:gfxdata="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" path="m6915912,l127,r,1397l,1397,,4445r127,l127,19685r6915785,l6915912,xe" fillcolor="#9f9f9f" stroked="f">
                   <v:path arrowok="t"/>
                 </v:shape>
@@ -19101,7 +19110,7 @@
           </mc:Choice>
           <mc:Fallback>
             <w:pict>
-              <v:shape w14:anchorId="6289D300" id="Graphic 91" o:spid="_x0000_s1026" style="position:absolute;margin-left:40.45pt;margin-top:11.5pt;width:535.7pt;height:.85pt;z-index:-15716352;visibility:visible;mso-wrap-style:square;mso-wrap-distance-left:0;mso-wrap-distance-top:0;mso-wrap-distance-right:0;mso-wrap-distance-bottom:0;mso-position-horizontal:absolute;mso-position-horizontal-relative:page;mso-position-vertical:absolute;mso-position-vertical-relative:text;v-text-anchor:top" coordsize="6803390,10795" o:gfxdata="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" path="m6802881,l,,,10667r6802881,l6802881,xe" fillcolor="black" stroked="f">
+              <v:shape w14:anchorId="79C3A645" id="Graphic 91" o:spid="_x0000_s1026" style="position:absolute;margin-left:40.45pt;margin-top:11.5pt;width:535.7pt;height:.85pt;z-index:-15716352;visibility:visible;mso-wrap-style:square;mso-wrap-distance-left:0;mso-wrap-distance-top:0;mso-wrap-distance-right:0;mso-wrap-distance-bottom:0;mso-position-horizontal:absolute;mso-position-horizontal-relative:page;mso-position-vertical:absolute;mso-position-vertical-relative:text;v-text-anchor:top" coordsize="6803390,10795" o:gfxdata="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" path="m6802881,l,,,10667r6802881,l6802881,xe" fillcolor="black" stroked="f">
                 <v:path arrowok="t"/>
                 <w10:wrap type="topAndBottom" anchorx="page"/>
               </v:shape>
@@ -20788,7 +20797,7 @@
           </mc:Choice>
           <mc:Fallback>
             <w:pict>
-              <v:group w14:anchorId="54487AA3" id="Group 92" o:spid="_x0000_s1026" style="position:absolute;margin-left:40.45pt;margin-top:10.5pt;width:544.7pt;height:1.65pt;z-index:-15715840;mso-wrap-distance-left:0;mso-wrap-distance-right:0;mso-position-horizontal-relative:page" coordsize="69176,209" o:gfxdata="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">
+              <v:group w14:anchorId="64085469" id="Group 92" o:spid="_x0000_s1026" style="position:absolute;margin-left:40.45pt;margin-top:10.5pt;width:544.7pt;height:1.65pt;z-index:-15715840;mso-wrap-distance-left:0;mso-wrap-distance-right:0;mso-position-horizontal-relative:page" coordsize="69176,209" o:gfxdata="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">
                 <v:shape id="Graphic 93" o:spid="_x0000_s1027" style="position:absolute;width:69164;height:196;visibility:visible;mso-wrap-style:square;v-text-anchor:top" coordsize="6916420,19685" o:gfxdata="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" path="m6915912,l127,r,774l,774,,3810r127,l127,19685r6915785,l6915912,xe" fillcolor="#9f9f9f" stroked="f">
                   <v:path arrowok="t"/>
                 </v:shape>
@@ -21664,7 +21673,7 @@
           </mc:Choice>
           <mc:Fallback>
             <w:pict>
-              <v:shape w14:anchorId="610DFB91" id="Graphic 99" o:spid="_x0000_s1026" style="position:absolute;margin-left:40.45pt;margin-top:12.85pt;width:535.7pt;height:.85pt;z-index:-15715328;visibility:visible;mso-wrap-style:square;mso-wrap-distance-left:0;mso-wrap-distance-top:0;mso-wrap-distance-right:0;mso-wrap-distance-bottom:0;mso-position-horizontal:absolute;mso-position-horizontal-relative:page;mso-position-vertical:absolute;mso-position-vertical-relative:text;v-text-anchor:top" coordsize="6803390,10795" o:gfxdata="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" path="m6802881,l,,,10668r6802881,l6802881,xe" fillcolor="black" stroked="f">
+              <v:shape w14:anchorId="6E6F890E" id="Graphic 99" o:spid="_x0000_s1026" style="position:absolute;margin-left:40.45pt;margin-top:12.85pt;width:535.7pt;height:.85pt;z-index:-15715328;visibility:visible;mso-wrap-style:square;mso-wrap-distance-left:0;mso-wrap-distance-top:0;mso-wrap-distance-right:0;mso-wrap-distance-bottom:0;mso-position-horizontal:absolute;mso-position-horizontal-relative:page;mso-position-vertical:absolute;mso-position-vertical-relative:text;v-text-anchor:top" coordsize="6803390,10795" o:gfxdata="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" path="m6802881,l,,,10668r6802881,l6802881,xe" fillcolor="black" stroked="f">
                 <v:path arrowok="t"/>
                 <w10:wrap type="topAndBottom" anchorx="page"/>
               </v:shape>
@@ -22722,7 +22731,7 @@
           </mc:Choice>
           <mc:Fallback>
             <w:pict>
-              <v:group w14:anchorId="402193BA" id="Group 100" o:spid="_x0000_s1026" style="position:absolute;margin-left:40.45pt;margin-top:10.55pt;width:544.7pt;height:1.6pt;z-index:-15714816;mso-wrap-distance-left:0;mso-wrap-distance-right:0;mso-position-horizontal-relative:page" coordsize="69176,203" o:gfxdata="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">
+              <v:group w14:anchorId="7301CC17" id="Group 100" o:spid="_x0000_s1026" style="position:absolute;margin-left:40.45pt;margin-top:10.55pt;width:544.7pt;height:1.6pt;z-index:-15714816;mso-wrap-distance-left:0;mso-wrap-distance-right:0;mso-position-horizontal-relative:page" coordsize="69176,203" o:gfxdata="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">
                 <v:shape id="Graphic 101" o:spid="_x0000_s1027" style="position:absolute;width:69164;height:196;visibility:visible;mso-wrap-style:square;v-text-anchor:top" coordsize="6916420,19685" o:gfxdata="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" path="m6915912,l127,r,241l,241,,3289r127,l127,19672r6915785,l6915912,xe" fillcolor="#9f9f9f" stroked="f">
                   <v:path arrowok="t"/>
                 </v:shape>
@@ -24347,7 +24356,7 @@
           </mc:Choice>
           <mc:Fallback>
             <w:pict>
-              <v:group w14:anchorId="5EE8DCED" id="Group 107" o:spid="_x0000_s1026" style="position:absolute;margin-left:40.45pt;margin-top:10.55pt;width:544.7pt;height:1.65pt;z-index:-15714304;mso-wrap-distance-left:0;mso-wrap-distance-right:0;mso-position-horizontal-relative:page" coordsize="69176,209" o:gfxdata="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">
+              <v:group w14:anchorId="4758817D" id="Group 107" o:spid="_x0000_s1026" style="position:absolute;margin-left:40.45pt;margin-top:10.55pt;width:544.7pt;height:1.65pt;z-index:-15714304;mso-wrap-distance-left:0;mso-wrap-distance-right:0;mso-position-horizontal-relative:page" coordsize="69176,209" o:gfxdata="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">
                 <v:shape id="Graphic 108" o:spid="_x0000_s1027" style="position:absolute;width:69164;height:196;visibility:visible;mso-wrap-style:square;v-text-anchor:top" coordsize="6916420,19685" o:gfxdata="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" path="m6915912,l127,r,635l,635,,3683r127,l127,19685r6915785,l6915912,xe" fillcolor="#9f9f9f" stroked="f">
                   <v:path arrowok="t"/>
                 </v:shape>
@@ -24767,7 +24776,7 @@
           </mc:Choice>
           <mc:Fallback>
             <w:pict>
-              <v:group w14:anchorId="1185A0FD" id="Group 114" o:spid="_x0000_s1026" style="position:absolute;margin-left:40.45pt;margin-top:10.55pt;width:544.7pt;height:1.65pt;z-index:-15713792;mso-wrap-distance-left:0;mso-wrap-distance-right:0;mso-position-horizontal-relative:page" coordsize="69176,209" o:gfxdata="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">
+              <v:group w14:anchorId="7BDB8AD3" id="Group 114" o:spid="_x0000_s1026" style="position:absolute;margin-left:40.45pt;margin-top:10.55pt;width:544.7pt;height:1.65pt;z-index:-15713792;mso-wrap-distance-left:0;mso-wrap-distance-right:0;mso-position-horizontal-relative:page" coordsize="69176,209" o:gfxdata="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">
                 <v:shape id="Graphic 115" o:spid="_x0000_s1027" style="position:absolute;width:69164;height:196;visibility:visible;mso-wrap-style:square;v-text-anchor:top" coordsize="6916420,19685" o:gfxdata="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" path="m6915912,l127,r,647l,647,,3683r127,l127,19685r6915785,l6915912,xe" fillcolor="#9f9f9f" stroked="f">
                   <v:path arrowok="t"/>
                 </v:shape>
@@ -25531,7 +25540,7 @@
           </mc:Choice>
           <mc:Fallback>
             <w:pict>
-              <v:group w14:anchorId="0EB55E7F" id="Group 121" o:spid="_x0000_s1026" style="position:absolute;margin-left:40.45pt;margin-top:25.2pt;width:544.7pt;height:1.65pt;z-index:-15713280;mso-wrap-distance-left:0;mso-wrap-distance-right:0;mso-position-horizontal-relative:page" coordsize="69176,209" o:gfxdata="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">
+              <v:group w14:anchorId="2E34ACFF" id="Group 121" o:spid="_x0000_s1026" style="position:absolute;margin-left:40.45pt;margin-top:25.2pt;width:544.7pt;height:1.65pt;z-index:-15713280;mso-wrap-distance-left:0;mso-wrap-distance-right:0;mso-position-horizontal-relative:page" coordsize="69176,209" o:gfxdata="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">
                 <v:shape id="Graphic 122" o:spid="_x0000_s1027" style="position:absolute;width:69164;height:196;visibility:visible;mso-wrap-style:square;v-text-anchor:top" coordsize="6916420,19685" o:gfxdata="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" path="m6915912,l127,r,1028l,1028,,4064r127,l127,19685r6915785,l6915912,xe" fillcolor="#9f9f9f" stroked="f">
                   <v:path arrowok="t"/>
                 </v:shape>
@@ -26223,7 +26232,7 @@
           </mc:Choice>
           <mc:Fallback>
             <w:pict>
-              <v:group w14:anchorId="7279D171" id="Group 128" o:spid="_x0000_s1026" style="position:absolute;margin-left:40.15pt;margin-top:19.85pt;width:544.7pt;height:1.6pt;z-index:-251652096;mso-wrap-distance-left:0;mso-wrap-distance-right:0;mso-position-horizontal-relative:page" coordsize="69176,203" o:gfxdata="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">
+              <v:group w14:anchorId="591EC9CB" id="Group 128" o:spid="_x0000_s1026" style="position:absolute;margin-left:40.15pt;margin-top:19.85pt;width:544.7pt;height:1.6pt;z-index:-251652096;mso-wrap-distance-left:0;mso-wrap-distance-right:0;mso-position-horizontal-relative:page" coordsize="69176,203" o:gfxdata="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">
                 <v:shape id="Graphic 129" o:spid="_x0000_s1027" style="position:absolute;width:69164;height:196;visibility:visible;mso-wrap-style:square;v-text-anchor:top" coordsize="6916420,19685" o:gfxdata="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" path="m6915912,r-1524,l3048,,127,,,,,3048r127,l127,19685r6915785,l6915912,xe" fillcolor="#9f9f9f" stroked="f">
                   <v:path arrowok="t"/>
                 </v:shape>
@@ -26253,19 +26262,7 @@
           <w:rPr>
             <w:rStyle w:val="Hyperlink"/>
           </w:rPr>
-          <w:t>https://drive.google.com/drive/f</w:t>
-        </w:r>
-        <w:r>
-          <w:rPr>
-            <w:rStyle w:val="Hyperlink"/>
-          </w:rPr>
-          <w:t>o</w:t>
-        </w:r>
-        <w:r>
-          <w:rPr>
-            <w:rStyle w:val="Hyperlink"/>
-          </w:rPr>
-          <w:t>lders/1Rkzdks6Us1Uq2SRB4nxMAb83jN5bpHll</w:t>
+          <w:t>https://drive.google.com/drive/folders/1Rkzdks6Us1Uq2SRB4nxMAb83jN5bpHll</w:t>
         </w:r>
       </w:hyperlink>
     </w:p>
@@ -26354,37 +26351,7 @@
           <w:rPr>
             <w:rStyle w:val="Hyperlink"/>
           </w:rPr>
-          <w:t>https://github.com/meghanath0</w:t>
-        </w:r>
-        <w:r>
-          <w:rPr>
-            <w:rStyle w:val="Hyperlink"/>
-          </w:rPr>
-          <w:t>2</w:t>
-        </w:r>
-        <w:r>
-          <w:rPr>
-            <w:rStyle w:val="Hyperlink"/>
-          </w:rPr>
-          <w:t>2</w:t>
-        </w:r>
-        <w:r>
-          <w:rPr>
-            <w:rStyle w:val="Hyperlink"/>
-          </w:rPr>
-          <w:t>5/Visualization-Tool-for-Electric-</w:t>
-        </w:r>
-        <w:r>
-          <w:rPr>
-            <w:rStyle w:val="Hyperlink"/>
-          </w:rPr>
-          <w:t>V</w:t>
-        </w:r>
-        <w:r>
-          <w:rPr>
-            <w:rStyle w:val="Hyperlink"/>
-          </w:rPr>
-          <w:t>ehicle-Charge-and-Range-Analysis</w:t>
+          <w:t>https://github.com/meghanath0225/Visualization-Tool-for-Electric-Vehicle-Charge-and-Range-Analysis</w:t>
         </w:r>
       </w:hyperlink>
     </w:p>
@@ -26449,43 +26416,7 @@
           <w:rPr>
             <w:rStyle w:val="Hyperlink"/>
           </w:rPr>
-          <w:t>https://public.tableau.com/app/pr</w:t>
-        </w:r>
-        <w:r>
-          <w:rPr>
-            <w:rStyle w:val="Hyperlink"/>
-          </w:rPr>
-          <w:t>o</w:t>
-        </w:r>
-        <w:r>
-          <w:rPr>
-            <w:rStyle w:val="Hyperlink"/>
-          </w:rPr>
-          <w:t>file</w:t>
-        </w:r>
-        <w:r>
-          <w:rPr>
-            <w:rStyle w:val="Hyperlink"/>
-          </w:rPr>
-          <w:t>/</w:t>
-        </w:r>
-        <w:r>
-          <w:rPr>
-            <w:rStyle w:val="Hyperlink"/>
-          </w:rPr>
-          <w:t>v</w:t>
-        </w:r>
-        <w:r>
-          <w:rPr>
-            <w:rStyle w:val="Hyperlink"/>
-          </w:rPr>
-          <w:t>u</w:t>
-        </w:r>
-        <w:r>
-          <w:rPr>
-            <w:rStyle w:val="Hyperlink"/>
-          </w:rPr>
-          <w:t>tti.venkata.meghanath/viz/ElectricCarsAnalyticsDashboard_17831451243460/Dashboard1</w:t>
+          <w:t>https://public.tableau.com/app/profile/vutti.venkata.meghanath/viz/ElectricCarsAnalyticsDashboard_17831451243460/Dashboard1</w:t>
         </w:r>
       </w:hyperlink>
     </w:p>
@@ -26539,31 +26470,7 @@
           <w:rPr>
             <w:rStyle w:val="Hyperlink"/>
           </w:rPr>
-          <w:t>https://public.tableau.com/a</w:t>
-        </w:r>
-        <w:r>
-          <w:rPr>
-            <w:rStyle w:val="Hyperlink"/>
-          </w:rPr>
-          <w:t>p</w:t>
-        </w:r>
-        <w:r>
-          <w:rPr>
-            <w:rStyle w:val="Hyperlink"/>
-          </w:rPr>
-          <w:t>p/profile/vutt</w:t>
-        </w:r>
-        <w:r>
-          <w:rPr>
-            <w:rStyle w:val="Hyperlink"/>
-          </w:rPr>
-          <w:t>i</w:t>
-        </w:r>
-        <w:r>
-          <w:rPr>
-            <w:rStyle w:val="Hyperlink"/>
-          </w:rPr>
-          <w:t>.venkata.meghanath/viz/StoryofElectricCarsinIndia_17832669081640/StoryofElectricCarsinIndia</w:t>
+          <w:t>https://public.tableau.com/app/profile/vutti.venkata.meghanath/viz/StoryofElectricCarsinIndia_17832669081640/StoryofElectricCarsinIndia</w:t>
         </w:r>
       </w:hyperlink>
     </w:p>
@@ -27012,7 +26919,7 @@
           </mc:Choice>
           <mc:Fallback>
             <w:pict>
-              <v:group w14:anchorId="125076BE" id="Group 135" o:spid="_x0000_s1026" style="position:absolute;margin-left:40.45pt;margin-top:25.1pt;width:544.7pt;height:1.65pt;z-index:-15712256;mso-wrap-distance-left:0;mso-wrap-distance-right:0;mso-position-horizontal-relative:page" coordsize="69176,209" o:gfxdata="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">
+              <v:group w14:anchorId="1B7B80C0" id="Group 135" o:spid="_x0000_s1026" style="position:absolute;margin-left:40.45pt;margin-top:25.1pt;width:544.7pt;height:1.65pt;z-index:-15712256;mso-wrap-distance-left:0;mso-wrap-distance-right:0;mso-position-horizontal-relative:page" coordsize="69176,209" o:gfxdata="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">
                 <v:shape id="Graphic 136" o:spid="_x0000_s1027" style="position:absolute;width:69164;height:203;visibility:visible;mso-wrap-style:square;v-text-anchor:top" coordsize="6916420,20320" o:gfxdata="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" path="m6915912,l127,r,901l,901,,3937r127,l127,20320r6915785,l6915912,xe" fillcolor="#9f9f9f" stroked="f">
                   <v:path arrowok="t"/>
                 </v:shape>

</xml_diff>